<commit_message>
Systemised percussion section and some formatting. To resume work on collisions.
</commit_message>
<xml_diff>
--- a/Documentation/SCO Project Style Guide.docx
+++ b/Documentation/SCO Project Style Guide.docx
@@ -1,6 +1,6 @@
 
 <file path=word/document.xml><?xml version="1.0" encoding="utf-8"?>
-<w:document xmlns:wpc="http://schemas.microsoft.com/office/word/2010/wordprocessingCanvas" xmlns:cx="http://schemas.microsoft.com/office/drawing/2014/chartex" xmlns:cx1="http://schemas.microsoft.com/office/drawing/2015/9/8/chartex" xmlns:cx2="http://schemas.microsoft.com/office/drawing/2015/10/21/chartex" xmlns:cx3="http://schemas.microsoft.com/office/drawing/2016/5/9/chartex" xmlns:cx4="http://schemas.microsoft.com/office/drawing/2016/5/10/chartex" xmlns:cx5="http://schemas.microsoft.com/office/drawing/2016/5/11/chartex" xmlns:cx6="http://schemas.microsoft.com/office/drawing/2016/5/12/chartex" xmlns:cx7="http://schemas.microsoft.com/office/drawing/2016/5/13/chartex" xmlns:cx8="http://schemas.microsoft.com/office/drawing/2016/5/14/chartex" xmlns:mc="http://schemas.openxmlformats.org/markup-compatibility/2006" xmlns:aink="http://schemas.microsoft.com/office/drawing/2016/ink" xmlns:am3d="http://schemas.microsoft.com/office/drawing/2017/model3d" xmlns:o="urn:schemas-microsoft-com:office:office" xmlns:oel="http://schemas.microsoft.com/office/2019/extlst" xmlns:r="http://schemas.openxmlformats.org/officeDocument/2006/relationships" xmlns:m="http://schemas.openxmlformats.org/officeDocument/2006/math" xmlns:v="urn:schemas-microsoft-com:vml" xmlns:wp14="http://schemas.microsoft.com/office/word/2010/wordprocessingDrawing" xmlns:wp="http://schemas.openxmlformats.org/drawingml/2006/wordprocessingDrawing" xmlns:w10="urn:schemas-microsoft-com:office:word" xmlns:w="http://schemas.openxmlformats.org/wordprocessingml/2006/main" xmlns:w14="http://schemas.microsoft.com/office/word/2010/wordml" xmlns:w15="http://schemas.microsoft.com/office/word/2012/wordml" xmlns:w16cex="http://schemas.microsoft.com/office/word/2018/wordml/cex" xmlns:w16cid="http://schemas.microsoft.com/office/word/2016/wordml/cid" xmlns:w16="http://schemas.microsoft.com/office/word/2018/wordml" xmlns:w16sdtdh="http://schemas.microsoft.com/office/word/2020/wordml/sdtdatahash" xmlns:w16se="http://schemas.microsoft.com/office/word/2015/wordml/symex" xmlns:wpg="http://schemas.microsoft.com/office/word/2010/wordprocessingGroup" xmlns:wpi="http://schemas.microsoft.com/office/word/2010/wordprocessingInk" xmlns:wne="http://schemas.microsoft.com/office/word/2006/wordml" xmlns:wps="http://schemas.microsoft.com/office/word/2010/wordprocessingShape" mc:Ignorable="w14 w15 w16se w16cid w16 w16cex w16sdtdh wp14">
+<w:document xmlns:wpc="http://schemas.microsoft.com/office/word/2010/wordprocessingCanvas" xmlns:cx="http://schemas.microsoft.com/office/drawing/2014/chartex" xmlns:cx1="http://schemas.microsoft.com/office/drawing/2015/9/8/chartex" xmlns:cx2="http://schemas.microsoft.com/office/drawing/2015/10/21/chartex" xmlns:cx3="http://schemas.microsoft.com/office/drawing/2016/5/9/chartex" xmlns:cx4="http://schemas.microsoft.com/office/drawing/2016/5/10/chartex" xmlns:cx5="http://schemas.microsoft.com/office/drawing/2016/5/11/chartex" xmlns:cx6="http://schemas.microsoft.com/office/drawing/2016/5/12/chartex" xmlns:cx7="http://schemas.microsoft.com/office/drawing/2016/5/13/chartex" xmlns:cx8="http://schemas.microsoft.com/office/drawing/2016/5/14/chartex" xmlns:mc="http://schemas.openxmlformats.org/markup-compatibility/2006" xmlns:aink="http://schemas.microsoft.com/office/drawing/2016/ink" xmlns:am3d="http://schemas.microsoft.com/office/drawing/2017/model3d" xmlns:o="urn:schemas-microsoft-com:office:office" xmlns:oel="http://schemas.microsoft.com/office/2019/extlst" xmlns:r="http://schemas.openxmlformats.org/officeDocument/2006/relationships" xmlns:m="http://schemas.openxmlformats.org/officeDocument/2006/math" xmlns:v="urn:schemas-microsoft-com:vml" xmlns:wp14="http://schemas.microsoft.com/office/word/2010/wordprocessingDrawing" xmlns:wp="http://schemas.openxmlformats.org/drawingml/2006/wordprocessingDrawing" xmlns:w10="urn:schemas-microsoft-com:office:word" xmlns:w="http://schemas.openxmlformats.org/wordprocessingml/2006/main" xmlns:w14="http://schemas.microsoft.com/office/word/2010/wordml" xmlns:w15="http://schemas.microsoft.com/office/word/2012/wordml" xmlns:w16cex="http://schemas.microsoft.com/office/word/2018/wordml/cex" xmlns:w16cid="http://schemas.microsoft.com/office/word/2016/wordml/cid" xmlns:w16="http://schemas.microsoft.com/office/word/2018/wordml" xmlns:w16du="http://schemas.microsoft.com/office/word/2023/wordml/word16du" xmlns:w16sdtdh="http://schemas.microsoft.com/office/word/2020/wordml/sdtdatahash" xmlns:w16se="http://schemas.microsoft.com/office/word/2015/wordml/symex" xmlns:wpg="http://schemas.microsoft.com/office/word/2010/wordprocessingGroup" xmlns:wpi="http://schemas.microsoft.com/office/word/2010/wordprocessingInk" xmlns:wne="http://schemas.microsoft.com/office/word/2006/wordml" xmlns:wps="http://schemas.microsoft.com/office/word/2010/wordprocessingShape" mc:Ignorable="w14 w15 w16se w16cid w16 w16cex w16sdtdh w16du wp14">
   <w:body>
     <w:p>
       <w:pPr>
@@ -82,7 +82,15 @@
       </w:r>
       <w:proofErr w:type="gramEnd"/>
       <w:r>
-        <w:t xml:space="preserve"> 4.1mm. Ok to reduce on certain pages to allow more music to fit (nothing smaller than 3.7mm). Overall staff size can also be reduced to 4mm or increased to 4.4mm where applicable. Any other sizes, please check with me.</w:t>
+        <w:t xml:space="preserve"> 4.1mm. Ok to </w:t>
+      </w:r>
+      <w:proofErr w:type="gramStart"/>
+      <w:r>
+        <w:t>reduce on</w:t>
+      </w:r>
+      <w:proofErr w:type="gramEnd"/>
+      <w:r>
+        <w:t xml:space="preserve"> certain pages to allow more music to fit (nothing smaller than 3.7mm). Overall staff size can also be reduced to 4mm or increased to 4.4mm where applicable. Any other sizes, please check with me.</w:t>
       </w:r>
     </w:p>
     <w:p/>
@@ -322,15 +330,7 @@
     <w:p/>
     <w:p>
       <w:r>
-        <w:t xml:space="preserve">Example setup below. Please add </w:t>
-      </w:r>
-      <w:proofErr w:type="gramStart"/>
-      <w:r>
-        <w:t>all of</w:t>
-      </w:r>
-      <w:proofErr w:type="gramEnd"/>
-      <w:r>
-        <w:t xml:space="preserve"> these details into the info and </w:t>
+        <w:t xml:space="preserve">Example setup below. Please add all of these details into the info and </w:t>
       </w:r>
       <w:r>
         <w:rPr>
@@ -597,15 +597,7 @@
     <w:p/>
     <w:p>
       <w:r>
-        <w:t xml:space="preserve">Additionally, if the composer didn’t use instruments changes in the first place, you will need to select the bars for which </w:t>
-      </w:r>
-      <w:proofErr w:type="gramStart"/>
-      <w:r>
-        <w:t>these particular instrument</w:t>
-      </w:r>
-      <w:proofErr w:type="gramEnd"/>
-      <w:r>
-        <w:t xml:space="preserve"> is being used, and just change it to percussion 5 lines (or whatever number of lines is being used). Then you can simply change the instrument name text/abbreviation accordingly. </w:t>
+        <w:t xml:space="preserve">Additionally, if the composer didn’t use instruments changes in the first place, you will need to select the bars for which these particular instrument is being used, and just change it to percussion 5 lines (or whatever number of lines is being used). Then you can simply change the instrument name text/abbreviation accordingly. </w:t>
       </w:r>
     </w:p>
     <w:p>
@@ -709,7 +701,7 @@
 </file>
 
 <file path=word/styles.xml><?xml version="1.0" encoding="utf-8"?>
-<w:styles xmlns:mc="http://schemas.openxmlformats.org/markup-compatibility/2006" xmlns:r="http://schemas.openxmlformats.org/officeDocument/2006/relationships" xmlns:w="http://schemas.openxmlformats.org/wordprocessingml/2006/main" xmlns:w14="http://schemas.microsoft.com/office/word/2010/wordml" xmlns:w15="http://schemas.microsoft.com/office/word/2012/wordml" xmlns:w16cex="http://schemas.microsoft.com/office/word/2018/wordml/cex" xmlns:w16cid="http://schemas.microsoft.com/office/word/2016/wordml/cid" xmlns:w16="http://schemas.microsoft.com/office/word/2018/wordml" xmlns:w16sdtdh="http://schemas.microsoft.com/office/word/2020/wordml/sdtdatahash" xmlns:w16se="http://schemas.microsoft.com/office/word/2015/wordml/symex" mc:Ignorable="w14 w15 w16se w16cid w16 w16cex w16sdtdh">
+<w:styles xmlns:mc="http://schemas.openxmlformats.org/markup-compatibility/2006" xmlns:r="http://schemas.openxmlformats.org/officeDocument/2006/relationships" xmlns:w="http://schemas.openxmlformats.org/wordprocessingml/2006/main" xmlns:w14="http://schemas.microsoft.com/office/word/2010/wordml" xmlns:w15="http://schemas.microsoft.com/office/word/2012/wordml" xmlns:w16cex="http://schemas.microsoft.com/office/word/2018/wordml/cex" xmlns:w16cid="http://schemas.microsoft.com/office/word/2016/wordml/cid" xmlns:w16="http://schemas.microsoft.com/office/word/2018/wordml" xmlns:w16du="http://schemas.microsoft.com/office/word/2023/wordml/word16du" xmlns:w16sdtdh="http://schemas.microsoft.com/office/word/2020/wordml/sdtdatahash" xmlns:w16se="http://schemas.microsoft.com/office/word/2015/wordml/symex" mc:Ignorable="w14 w15 w16se w16cid w16 w16cex w16sdtdh w16du">
   <w:docDefaults>
     <w:rPrDefault>
       <w:rPr>

</xml_diff>

<commit_message>
Added 1st piece original and edited style guide
</commit_message>
<xml_diff>
--- a/Documentation/SCO Project Style Guide.docx
+++ b/Documentation/SCO Project Style Guide.docx
@@ -1,6 +1,6 @@
 
 <file path=word/document.xml><?xml version="1.0" encoding="utf-8"?>
-<w:document xmlns:wpc="http://schemas.microsoft.com/office/word/2010/wordprocessingCanvas" xmlns:cx="http://schemas.microsoft.com/office/drawing/2014/chartex" xmlns:cx1="http://schemas.microsoft.com/office/drawing/2015/9/8/chartex" xmlns:cx2="http://schemas.microsoft.com/office/drawing/2015/10/21/chartex" xmlns:cx3="http://schemas.microsoft.com/office/drawing/2016/5/9/chartex" xmlns:cx4="http://schemas.microsoft.com/office/drawing/2016/5/10/chartex" xmlns:cx5="http://schemas.microsoft.com/office/drawing/2016/5/11/chartex" xmlns:cx6="http://schemas.microsoft.com/office/drawing/2016/5/12/chartex" xmlns:cx7="http://schemas.microsoft.com/office/drawing/2016/5/13/chartex" xmlns:cx8="http://schemas.microsoft.com/office/drawing/2016/5/14/chartex" xmlns:mc="http://schemas.openxmlformats.org/markup-compatibility/2006" xmlns:aink="http://schemas.microsoft.com/office/drawing/2016/ink" xmlns:am3d="http://schemas.microsoft.com/office/drawing/2017/model3d" xmlns:o="urn:schemas-microsoft-com:office:office" xmlns:oel="http://schemas.microsoft.com/office/2019/extlst" xmlns:r="http://schemas.openxmlformats.org/officeDocument/2006/relationships" xmlns:m="http://schemas.openxmlformats.org/officeDocument/2006/math" xmlns:v="urn:schemas-microsoft-com:vml" xmlns:wp14="http://schemas.microsoft.com/office/word/2010/wordprocessingDrawing" xmlns:wp="http://schemas.openxmlformats.org/drawingml/2006/wordprocessingDrawing" xmlns:w10="urn:schemas-microsoft-com:office:word" xmlns:w="http://schemas.openxmlformats.org/wordprocessingml/2006/main" xmlns:w14="http://schemas.microsoft.com/office/word/2010/wordml" xmlns:w15="http://schemas.microsoft.com/office/word/2012/wordml" xmlns:w16cex="http://schemas.microsoft.com/office/word/2018/wordml/cex" xmlns:w16cid="http://schemas.microsoft.com/office/word/2016/wordml/cid" xmlns:w16="http://schemas.microsoft.com/office/word/2018/wordml" xmlns:w16du="http://schemas.microsoft.com/office/word/2023/wordml/word16du" xmlns:w16sdtdh="http://schemas.microsoft.com/office/word/2020/wordml/sdtdatahash" xmlns:w16se="http://schemas.microsoft.com/office/word/2015/wordml/symex" xmlns:wpg="http://schemas.microsoft.com/office/word/2010/wordprocessingGroup" xmlns:wpi="http://schemas.microsoft.com/office/word/2010/wordprocessingInk" xmlns:wne="http://schemas.microsoft.com/office/word/2006/wordml" xmlns:wps="http://schemas.microsoft.com/office/word/2010/wordprocessingShape" mc:Ignorable="w14 w15 w16se w16cid w16 w16cex w16sdtdh w16du wp14">
+<w:document xmlns:wpc="http://schemas.microsoft.com/office/word/2010/wordprocessingCanvas" xmlns:cx="http://schemas.microsoft.com/office/drawing/2014/chartex" xmlns:cx1="http://schemas.microsoft.com/office/drawing/2015/9/8/chartex" xmlns:cx2="http://schemas.microsoft.com/office/drawing/2015/10/21/chartex" xmlns:cx3="http://schemas.microsoft.com/office/drawing/2016/5/9/chartex" xmlns:cx4="http://schemas.microsoft.com/office/drawing/2016/5/10/chartex" xmlns:cx5="http://schemas.microsoft.com/office/drawing/2016/5/11/chartex" xmlns:cx6="http://schemas.microsoft.com/office/drawing/2016/5/12/chartex" xmlns:cx7="http://schemas.microsoft.com/office/drawing/2016/5/13/chartex" xmlns:cx8="http://schemas.microsoft.com/office/drawing/2016/5/14/chartex" xmlns:mc="http://schemas.openxmlformats.org/markup-compatibility/2006" xmlns:aink="http://schemas.microsoft.com/office/drawing/2016/ink" xmlns:am3d="http://schemas.microsoft.com/office/drawing/2017/model3d" xmlns:o="urn:schemas-microsoft-com:office:office" xmlns:oel="http://schemas.microsoft.com/office/2019/extlst" xmlns:r="http://schemas.openxmlformats.org/officeDocument/2006/relationships" xmlns:m="http://schemas.openxmlformats.org/officeDocument/2006/math" xmlns:v="urn:schemas-microsoft-com:vml" xmlns:wp14="http://schemas.microsoft.com/office/word/2010/wordprocessingDrawing" xmlns:wp="http://schemas.openxmlformats.org/drawingml/2006/wordprocessingDrawing" xmlns:w10="urn:schemas-microsoft-com:office:word" xmlns:w="http://schemas.openxmlformats.org/wordprocessingml/2006/main" xmlns:w14="http://schemas.microsoft.com/office/word/2010/wordml" xmlns:w15="http://schemas.microsoft.com/office/word/2012/wordml" xmlns:w16cex="http://schemas.microsoft.com/office/word/2018/wordml/cex" xmlns:w16cid="http://schemas.microsoft.com/office/word/2016/wordml/cid" xmlns:w16="http://schemas.microsoft.com/office/word/2018/wordml" xmlns:w16sdtdh="http://schemas.microsoft.com/office/word/2020/wordml/sdtdatahash" xmlns:w16se="http://schemas.microsoft.com/office/word/2015/wordml/symex" xmlns:wpg="http://schemas.microsoft.com/office/word/2010/wordprocessingGroup" xmlns:wpi="http://schemas.microsoft.com/office/word/2010/wordprocessingInk" xmlns:wne="http://schemas.microsoft.com/office/word/2006/wordml" xmlns:wps="http://schemas.microsoft.com/office/word/2010/wordprocessingShape" mc:Ignorable="w14 w15 w16se w16cid w16 w16cex w16sdtdh wp14">
   <w:body>
     <w:p>
       <w:pPr>
@@ -82,15 +82,7 @@
       </w:r>
       <w:proofErr w:type="gramEnd"/>
       <w:r>
-        <w:t xml:space="preserve"> 4.1mm. Ok to </w:t>
-      </w:r>
-      <w:proofErr w:type="gramStart"/>
-      <w:r>
-        <w:t>reduce on</w:t>
-      </w:r>
-      <w:proofErr w:type="gramEnd"/>
-      <w:r>
-        <w:t xml:space="preserve"> certain pages to allow more music to fit (nothing smaller than 3.7mm). Overall staff size can also be reduced to 4mm or increased to 4.4mm where applicable. Any other sizes, please check with me.</w:t>
+        <w:t xml:space="preserve"> 4.1mm. Ok to reduce on certain pages to allow more music to fit (nothing smaller than 3.7mm). Overall staff size can also be reduced to 4mm or increased to 4.4mm where applicable. Any other sizes, please check with me.</w:t>
       </w:r>
     </w:p>
     <w:p/>
@@ -600,16 +592,16 @@
         <w:t xml:space="preserve">Additionally, if the composer didn’t use instruments changes in the first place, you will need to select the bars for which these particular instrument is being used, and just change it to percussion 5 lines (or whatever number of lines is being used). Then you can simply change the instrument name text/abbreviation accordingly. </w:t>
       </w:r>
     </w:p>
+    <w:p/>
     <w:p>
       <w:r>
         <w:rPr>
           <w:noProof/>
         </w:rPr>
-        <w:lastRenderedPageBreak/>
         <w:drawing>
-          <wp:inline distT="0" distB="0" distL="0" distR="0" wp14:anchorId="30C68469" wp14:editId="0A925A64">
-            <wp:extent cx="5943600" cy="3838575"/>
-            <wp:effectExtent l="0" t="0" r="0" b="0"/>
+          <wp:inline distT="0" distB="0" distL="0" distR="0" wp14:anchorId="30C68469" wp14:editId="72155122">
+            <wp:extent cx="4559121" cy="2944432"/>
+            <wp:effectExtent l="0" t="0" r="635" b="2540"/>
             <wp:docPr id="234043849" name="Picture 1"/>
             <wp:cNvGraphicFramePr>
               <a:graphicFrameLocks xmlns:a="http://schemas.openxmlformats.org/drawingml/2006/main" noChangeAspect="1"/>
@@ -630,7 +622,7 @@
                   <pic:spPr>
                     <a:xfrm>
                       <a:off x="0" y="0"/>
-                      <a:ext cx="5943600" cy="3838575"/>
+                      <a:ext cx="4563330" cy="2947151"/>
                     </a:xfrm>
                     <a:prstGeom prst="rect">
                       <a:avLst/>
@@ -690,6 +682,179 @@
         <w:t xml:space="preserve"> piece. (The Capriccio of the Mountain Folk Song).</w:t>
       </w:r>
     </w:p>
+    <w:p/>
+    <w:p/>
+    <w:p>
+      <w:pPr>
+        <w:rPr>
+          <w:b/>
+          <w:bCs/>
+        </w:rPr>
+      </w:pPr>
+      <w:r>
+        <w:rPr>
+          <w:b/>
+          <w:bCs/>
+        </w:rPr>
+        <w:t>Score Order</w:t>
+      </w:r>
+    </w:p>
+    <w:p>
+      <w:pPr>
+        <w:rPr>
+          <w:b/>
+          <w:bCs/>
+        </w:rPr>
+      </w:pPr>
+    </w:p>
+    <w:p>
+      <w:r>
+        <w:t>G</w:t>
+      </w:r>
+      <w:r>
+        <w:rPr>
+          <w:rFonts w:hint="cs"/>
+        </w:rPr>
+        <w:t>roup all the winds by section i.e. [dizi</w:t>
+      </w:r>
+      <w:proofErr w:type="gramStart"/>
+      <w:r>
+        <w:rPr>
+          <w:rFonts w:hint="cs"/>
+        </w:rPr>
+        <w:t>][</w:t>
+      </w:r>
+      <w:proofErr w:type="gramEnd"/>
+      <w:r>
+        <w:rPr>
+          <w:rFonts w:hint="cs"/>
+        </w:rPr>
+        <w:t xml:space="preserve"> sheng][</w:t>
+      </w:r>
+      <w:proofErr w:type="spellStart"/>
+      <w:r>
+        <w:rPr>
+          <w:rFonts w:hint="cs"/>
+        </w:rPr>
+        <w:t>suona</w:t>
+      </w:r>
+      <w:proofErr w:type="spellEnd"/>
+      <w:r>
+        <w:rPr>
+          <w:rFonts w:hint="cs"/>
+        </w:rPr>
+        <w:t>/guan]. Please group the timpani with the rest of the percussion.</w:t>
+      </w:r>
+    </w:p>
+    <w:p/>
+    <w:p>
+      <w:pPr>
+        <w:rPr>
+          <w:rFonts w:ascii="Futura" w:hAnsi="Futura" w:cs="Futura"/>
+          <w:color w:val="222222"/>
+          <w:shd w:val="clear" w:color="auto" w:fill="FFFFFF"/>
+        </w:rPr>
+      </w:pPr>
+      <w:r>
+        <w:rPr>
+          <w:rFonts w:ascii="Futura" w:hAnsi="Futura" w:cs="Futura"/>
+          <w:color w:val="222222"/>
+          <w:shd w:val="clear" w:color="auto" w:fill="FFFFFF"/>
+        </w:rPr>
+        <w:t xml:space="preserve">Note from SCO: </w:t>
+      </w:r>
+      <w:r>
+        <w:rPr>
+          <w:rFonts w:ascii="Futura" w:hAnsi="Futura" w:cs="Futura" w:hint="cs"/>
+          <w:i/>
+          <w:iCs/>
+          <w:color w:val="222222"/>
+          <w:shd w:val="clear" w:color="auto" w:fill="FFFFFF"/>
+        </w:rPr>
+        <w:t xml:space="preserve">After more discussion with </w:t>
+      </w:r>
+      <w:proofErr w:type="spellStart"/>
+      <w:r>
+        <w:rPr>
+          <w:rFonts w:ascii="Futura" w:hAnsi="Futura" w:cs="Futura" w:hint="cs"/>
+          <w:i/>
+          <w:iCs/>
+          <w:color w:val="222222"/>
+          <w:shd w:val="clear" w:color="auto" w:fill="FFFFFF"/>
+        </w:rPr>
+        <w:t>Chenwei</w:t>
+      </w:r>
+      <w:proofErr w:type="spellEnd"/>
+      <w:r>
+        <w:rPr>
+          <w:rFonts w:ascii="Futura" w:hAnsi="Futura" w:cs="Futura" w:hint="cs"/>
+          <w:i/>
+          <w:iCs/>
+          <w:color w:val="222222"/>
+          <w:shd w:val="clear" w:color="auto" w:fill="FFFFFF"/>
+        </w:rPr>
+        <w:t xml:space="preserve">, could we put the sanxian between zhongruan and daruan as well? Same reasoning, sort by instrument range rather than family. </w:t>
+      </w:r>
+      <w:proofErr w:type="gramStart"/>
+      <w:r>
+        <w:rPr>
+          <w:rFonts w:ascii="Futura" w:hAnsi="Futura" w:cs="Futura" w:hint="cs"/>
+          <w:i/>
+          <w:iCs/>
+          <w:color w:val="222222"/>
+          <w:shd w:val="clear" w:color="auto" w:fill="FFFFFF"/>
+        </w:rPr>
+        <w:t>So</w:t>
+      </w:r>
+      <w:proofErr w:type="gramEnd"/>
+      <w:r>
+        <w:rPr>
+          <w:rFonts w:ascii="Futura" w:hAnsi="Futura" w:cs="Futura" w:hint="cs"/>
+          <w:i/>
+          <w:iCs/>
+          <w:color w:val="222222"/>
+          <w:shd w:val="clear" w:color="auto" w:fill="FFFFFF"/>
+        </w:rPr>
+        <w:t xml:space="preserve"> by putting the </w:t>
+      </w:r>
+      <w:proofErr w:type="spellStart"/>
+      <w:r>
+        <w:rPr>
+          <w:rFonts w:ascii="Futura" w:hAnsi="Futura" w:cs="Futura" w:hint="cs"/>
+          <w:i/>
+          <w:iCs/>
+          <w:color w:val="222222"/>
+          <w:shd w:val="clear" w:color="auto" w:fill="FFFFFF"/>
+        </w:rPr>
+        <w:t>guanzi</w:t>
+      </w:r>
+      <w:proofErr w:type="spellEnd"/>
+      <w:r>
+        <w:rPr>
+          <w:rFonts w:ascii="Futura" w:hAnsi="Futura" w:cs="Futura" w:hint="cs"/>
+          <w:i/>
+          <w:iCs/>
+          <w:color w:val="222222"/>
+          <w:shd w:val="clear" w:color="auto" w:fill="FFFFFF"/>
+        </w:rPr>
+        <w:t xml:space="preserve"> in a different group this solves the “sort by range” issue.</w:t>
+      </w:r>
+    </w:p>
+    <w:p>
+      <w:pPr>
+        <w:rPr>
+          <w:rFonts w:ascii="Futura" w:hAnsi="Futura" w:cs="Futura"/>
+          <w:color w:val="222222"/>
+          <w:shd w:val="clear" w:color="auto" w:fill="FFFFFF"/>
+        </w:rPr>
+      </w:pPr>
+    </w:p>
+    <w:p>
+      <w:r>
+        <w:t>Harp should be between percussion and strings, as in Symphony Orchestra setup.</w:t>
+      </w:r>
+    </w:p>
+    <w:p/>
     <w:sectPr>
       <w:pgSz w:w="12240" w:h="15840"/>
       <w:pgMar w:top="1440" w:right="1440" w:bottom="1440" w:left="1440" w:header="720" w:footer="720" w:gutter="0"/>
@@ -701,7 +866,7 @@
 </file>
 
 <file path=word/styles.xml><?xml version="1.0" encoding="utf-8"?>
-<w:styles xmlns:mc="http://schemas.openxmlformats.org/markup-compatibility/2006" xmlns:r="http://schemas.openxmlformats.org/officeDocument/2006/relationships" xmlns:w="http://schemas.openxmlformats.org/wordprocessingml/2006/main" xmlns:w14="http://schemas.microsoft.com/office/word/2010/wordml" xmlns:w15="http://schemas.microsoft.com/office/word/2012/wordml" xmlns:w16cex="http://schemas.microsoft.com/office/word/2018/wordml/cex" xmlns:w16cid="http://schemas.microsoft.com/office/word/2016/wordml/cid" xmlns:w16="http://schemas.microsoft.com/office/word/2018/wordml" xmlns:w16du="http://schemas.microsoft.com/office/word/2023/wordml/word16du" xmlns:w16sdtdh="http://schemas.microsoft.com/office/word/2020/wordml/sdtdatahash" xmlns:w16se="http://schemas.microsoft.com/office/word/2015/wordml/symex" mc:Ignorable="w14 w15 w16se w16cid w16 w16cex w16sdtdh w16du">
+<w:styles xmlns:mc="http://schemas.openxmlformats.org/markup-compatibility/2006" xmlns:r="http://schemas.openxmlformats.org/officeDocument/2006/relationships" xmlns:w="http://schemas.openxmlformats.org/wordprocessingml/2006/main" xmlns:w14="http://schemas.microsoft.com/office/word/2010/wordml" xmlns:w15="http://schemas.microsoft.com/office/word/2012/wordml" xmlns:w16cex="http://schemas.microsoft.com/office/word/2018/wordml/cex" xmlns:w16cid="http://schemas.microsoft.com/office/word/2016/wordml/cid" xmlns:w16="http://schemas.microsoft.com/office/word/2018/wordml" xmlns:w16sdtdh="http://schemas.microsoft.com/office/word/2020/wordml/sdtdatahash" xmlns:w16se="http://schemas.microsoft.com/office/word/2015/wordml/symex" mc:Ignorable="w14 w15 w16se w16cid w16 w16cex w16sdtdh">
   <w:docDefaults>
     <w:rPrDefault>
       <w:rPr>
@@ -1297,7 +1462,6 @@
   <w:style w:type="character" w:default="1" w:styleId="DefaultParagraphFont">
     <w:name w:val="Default Paragraph Font"/>
     <w:uiPriority w:val="1"/>
-    <w:semiHidden/>
     <w:unhideWhenUsed/>
   </w:style>
   <w:style w:type="table" w:default="1" w:styleId="TableNormal">

</xml_diff>

<commit_message>
Updated errata + significant alignment adjustments to most pages + simplification of divisi parallel passages.
</commit_message>
<xml_diff>
--- a/Documentation/SCO Project Style Guide.docx
+++ b/Documentation/SCO Project Style Guide.docx
@@ -1,6 +1,6 @@
 
 <file path=word/document.xml><?xml version="1.0" encoding="utf-8"?>
-<w:document xmlns:wpc="http://schemas.microsoft.com/office/word/2010/wordprocessingCanvas" xmlns:cx="http://schemas.microsoft.com/office/drawing/2014/chartex" xmlns:cx1="http://schemas.microsoft.com/office/drawing/2015/9/8/chartex" xmlns:cx2="http://schemas.microsoft.com/office/drawing/2015/10/21/chartex" xmlns:cx3="http://schemas.microsoft.com/office/drawing/2016/5/9/chartex" xmlns:cx4="http://schemas.microsoft.com/office/drawing/2016/5/10/chartex" xmlns:cx5="http://schemas.microsoft.com/office/drawing/2016/5/11/chartex" xmlns:cx6="http://schemas.microsoft.com/office/drawing/2016/5/12/chartex" xmlns:cx7="http://schemas.microsoft.com/office/drawing/2016/5/13/chartex" xmlns:cx8="http://schemas.microsoft.com/office/drawing/2016/5/14/chartex" xmlns:mc="http://schemas.openxmlformats.org/markup-compatibility/2006" xmlns:aink="http://schemas.microsoft.com/office/drawing/2016/ink" xmlns:am3d="http://schemas.microsoft.com/office/drawing/2017/model3d" xmlns:o="urn:schemas-microsoft-com:office:office" xmlns:oel="http://schemas.microsoft.com/office/2019/extlst" xmlns:r="http://schemas.openxmlformats.org/officeDocument/2006/relationships" xmlns:m="http://schemas.openxmlformats.org/officeDocument/2006/math" xmlns:v="urn:schemas-microsoft-com:vml" xmlns:wp14="http://schemas.microsoft.com/office/word/2010/wordprocessingDrawing" xmlns:wp="http://schemas.openxmlformats.org/drawingml/2006/wordprocessingDrawing" xmlns:w10="urn:schemas-microsoft-com:office:word" xmlns:w="http://schemas.openxmlformats.org/wordprocessingml/2006/main" xmlns:w14="http://schemas.microsoft.com/office/word/2010/wordml" xmlns:w15="http://schemas.microsoft.com/office/word/2012/wordml" xmlns:w16cex="http://schemas.microsoft.com/office/word/2018/wordml/cex" xmlns:w16cid="http://schemas.microsoft.com/office/word/2016/wordml/cid" xmlns:w16="http://schemas.microsoft.com/office/word/2018/wordml" xmlns:w16sdtdh="http://schemas.microsoft.com/office/word/2020/wordml/sdtdatahash" xmlns:w16se="http://schemas.microsoft.com/office/word/2015/wordml/symex" xmlns:wpg="http://schemas.microsoft.com/office/word/2010/wordprocessingGroup" xmlns:wpi="http://schemas.microsoft.com/office/word/2010/wordprocessingInk" xmlns:wne="http://schemas.microsoft.com/office/word/2006/wordml" xmlns:wps="http://schemas.microsoft.com/office/word/2010/wordprocessingShape" mc:Ignorable="w14 w15 w16se w16cid w16 w16cex w16sdtdh wp14">
+<w:document xmlns:wpc="http://schemas.microsoft.com/office/word/2010/wordprocessingCanvas" xmlns:cx="http://schemas.microsoft.com/office/drawing/2014/chartex" xmlns:cx1="http://schemas.microsoft.com/office/drawing/2015/9/8/chartex" xmlns:cx2="http://schemas.microsoft.com/office/drawing/2015/10/21/chartex" xmlns:cx3="http://schemas.microsoft.com/office/drawing/2016/5/9/chartex" xmlns:cx4="http://schemas.microsoft.com/office/drawing/2016/5/10/chartex" xmlns:cx5="http://schemas.microsoft.com/office/drawing/2016/5/11/chartex" xmlns:cx6="http://schemas.microsoft.com/office/drawing/2016/5/12/chartex" xmlns:cx7="http://schemas.microsoft.com/office/drawing/2016/5/13/chartex" xmlns:cx8="http://schemas.microsoft.com/office/drawing/2016/5/14/chartex" xmlns:mc="http://schemas.openxmlformats.org/markup-compatibility/2006" xmlns:aink="http://schemas.microsoft.com/office/drawing/2016/ink" xmlns:am3d="http://schemas.microsoft.com/office/drawing/2017/model3d" xmlns:o="urn:schemas-microsoft-com:office:office" xmlns:oel="http://schemas.microsoft.com/office/2019/extlst" xmlns:r="http://schemas.openxmlformats.org/officeDocument/2006/relationships" xmlns:m="http://schemas.openxmlformats.org/officeDocument/2006/math" xmlns:v="urn:schemas-microsoft-com:vml" xmlns:wp14="http://schemas.microsoft.com/office/word/2010/wordprocessingDrawing" xmlns:wp="http://schemas.openxmlformats.org/drawingml/2006/wordprocessingDrawing" xmlns:w10="urn:schemas-microsoft-com:office:word" xmlns:w="http://schemas.openxmlformats.org/wordprocessingml/2006/main" xmlns:w14="http://schemas.microsoft.com/office/word/2010/wordml" xmlns:w15="http://schemas.microsoft.com/office/word/2012/wordml" xmlns:w16cex="http://schemas.microsoft.com/office/word/2018/wordml/cex" xmlns:w16cid="http://schemas.microsoft.com/office/word/2016/wordml/cid" xmlns:w16="http://schemas.microsoft.com/office/word/2018/wordml" xmlns:w16du="http://schemas.microsoft.com/office/word/2023/wordml/word16du" xmlns:w16sdtdh="http://schemas.microsoft.com/office/word/2020/wordml/sdtdatahash" xmlns:w16se="http://schemas.microsoft.com/office/word/2015/wordml/symex" xmlns:wpg="http://schemas.microsoft.com/office/word/2010/wordprocessingGroup" xmlns:wpi="http://schemas.microsoft.com/office/word/2010/wordprocessingInk" xmlns:wne="http://schemas.microsoft.com/office/word/2006/wordml" xmlns:wps="http://schemas.microsoft.com/office/word/2010/wordprocessingShape" mc:Ignorable="w14 w15 w16se w16cid w16 w16cex w16sdtdh w16du wp14">
   <w:body>
     <w:p>
       <w:pPr>
@@ -61,28 +61,12 @@
     </w:p>
     <w:p>
       <w:r>
-        <w:t xml:space="preserve">Page Size: </w:t>
-      </w:r>
-      <w:proofErr w:type="gramStart"/>
-      <w:r>
-        <w:t>Typically</w:t>
-      </w:r>
-      <w:proofErr w:type="gramEnd"/>
-      <w:r>
-        <w:t xml:space="preserve"> A3</w:t>
-      </w:r>
-    </w:p>
-    <w:p>
-      <w:r>
-        <w:t xml:space="preserve">Staff Size: </w:t>
-      </w:r>
-      <w:proofErr w:type="gramStart"/>
-      <w:r>
-        <w:t>Typically</w:t>
-      </w:r>
-      <w:proofErr w:type="gramEnd"/>
-      <w:r>
-        <w:t xml:space="preserve"> 4.1mm. Ok to reduce on certain pages to allow more music to fit (nothing smaller than 3.7mm). Overall staff size can also be reduced to 4mm or increased to 4.4mm where applicable. Any other sizes, please check with me.</w:t>
+        <w:t>Page Size: Typically A3</w:t>
+      </w:r>
+    </w:p>
+    <w:p>
+      <w:r>
+        <w:t>Staff Size: Typically 4.1mm. Ok to reduce on certain pages to allow more music to fit (nothing smaller than 3.7mm). Overall staff size can also be reduced to 4mm or increased to 4.4mm where applicable. Any other sizes, please check with me.</w:t>
       </w:r>
     </w:p>
     <w:p/>
@@ -541,6 +525,55 @@
       </w:r>
       <w:r>
         <w:t xml:space="preserve">. If any of the existing changes don’t use this font, please change to this font. </w:t>
+      </w:r>
+    </w:p>
+    <w:p/>
+    <w:p>
+      <w:pPr>
+        <w:rPr>
+          <w:b/>
+          <w:bCs/>
+        </w:rPr>
+      </w:pPr>
+      <w:r>
+        <w:rPr>
+          <w:b/>
+          <w:bCs/>
+        </w:rPr>
+        <w:t>Strings</w:t>
+      </w:r>
+      <w:r>
+        <w:rPr>
+          <w:b/>
+          <w:bCs/>
+        </w:rPr>
+        <w:t xml:space="preserve"> and Plucked Instruments with Harmonics</w:t>
+      </w:r>
+    </w:p>
+    <w:p>
+      <w:r>
+        <w:t>If the fundamental note of a harmonic is notated</w:t>
+      </w:r>
+      <w:r>
+        <w:t xml:space="preserve"> and it would be an open string</w:t>
+      </w:r>
+      <w:r>
+        <w:t xml:space="preserve">, </w:t>
+      </w:r>
+      <w:r>
+        <w:t xml:space="preserve">the </w:t>
+      </w:r>
+      <w:r>
+        <w:t xml:space="preserve">notehead </w:t>
+      </w:r>
+      <w:r>
+        <w:t xml:space="preserve">should be set to </w:t>
+      </w:r>
+      <w:r>
+        <w:t xml:space="preserve">Special Note head 10. </w:t>
+      </w:r>
+      <w:r>
+        <w:t xml:space="preserve">If the fundamental note is an open string of an instrument (e.g. Violoncello sul A), the bracket special note should also be bracketed. </w:t>
       </w:r>
     </w:p>
     <w:p>
@@ -715,21 +748,7 @@
         <w:rPr>
           <w:rFonts w:hint="cs"/>
         </w:rPr>
-        <w:t>roup all the winds by section i.e. [dizi</w:t>
-      </w:r>
-      <w:proofErr w:type="gramStart"/>
-      <w:r>
-        <w:rPr>
-          <w:rFonts w:hint="cs"/>
-        </w:rPr>
-        <w:t>][</w:t>
-      </w:r>
-      <w:proofErr w:type="gramEnd"/>
-      <w:r>
-        <w:rPr>
-          <w:rFonts w:hint="cs"/>
-        </w:rPr>
-        <w:t xml:space="preserve"> sheng][</w:t>
+        <w:t>roup all the winds by section i.e. [dizi][ sheng][</w:t>
       </w:r>
       <w:proofErr w:type="spellStart"/>
       <w:r>
@@ -793,29 +812,7 @@
           <w:color w:val="222222"/>
           <w:shd w:val="clear" w:color="auto" w:fill="FFFFFF"/>
         </w:rPr>
-        <w:t xml:space="preserve">, could we put the sanxian between zhongruan and daruan as well? Same reasoning, sort by instrument range rather than family. </w:t>
-      </w:r>
-      <w:proofErr w:type="gramStart"/>
-      <w:r>
-        <w:rPr>
-          <w:rFonts w:ascii="Futura" w:hAnsi="Futura" w:cs="Futura" w:hint="cs"/>
-          <w:i/>
-          <w:iCs/>
-          <w:color w:val="222222"/>
-          <w:shd w:val="clear" w:color="auto" w:fill="FFFFFF"/>
-        </w:rPr>
-        <w:t>So</w:t>
-      </w:r>
-      <w:proofErr w:type="gramEnd"/>
-      <w:r>
-        <w:rPr>
-          <w:rFonts w:ascii="Futura" w:hAnsi="Futura" w:cs="Futura" w:hint="cs"/>
-          <w:i/>
-          <w:iCs/>
-          <w:color w:val="222222"/>
-          <w:shd w:val="clear" w:color="auto" w:fill="FFFFFF"/>
-        </w:rPr>
-        <w:t xml:space="preserve"> by putting the </w:t>
+        <w:t xml:space="preserve">, could we put the sanxian between zhongruan and daruan as well? Same reasoning, sort by instrument range rather than family. So by putting the </w:t>
       </w:r>
       <w:proofErr w:type="spellStart"/>
       <w:r>
@@ -866,7 +863,7 @@
 </file>
 
 <file path=word/styles.xml><?xml version="1.0" encoding="utf-8"?>
-<w:styles xmlns:mc="http://schemas.openxmlformats.org/markup-compatibility/2006" xmlns:r="http://schemas.openxmlformats.org/officeDocument/2006/relationships" xmlns:w="http://schemas.openxmlformats.org/wordprocessingml/2006/main" xmlns:w14="http://schemas.microsoft.com/office/word/2010/wordml" xmlns:w15="http://schemas.microsoft.com/office/word/2012/wordml" xmlns:w16cex="http://schemas.microsoft.com/office/word/2018/wordml/cex" xmlns:w16cid="http://schemas.microsoft.com/office/word/2016/wordml/cid" xmlns:w16="http://schemas.microsoft.com/office/word/2018/wordml" xmlns:w16sdtdh="http://schemas.microsoft.com/office/word/2020/wordml/sdtdatahash" xmlns:w16se="http://schemas.microsoft.com/office/word/2015/wordml/symex" mc:Ignorable="w14 w15 w16se w16cid w16 w16cex w16sdtdh">
+<w:styles xmlns:mc="http://schemas.openxmlformats.org/markup-compatibility/2006" xmlns:r="http://schemas.openxmlformats.org/officeDocument/2006/relationships" xmlns:w="http://schemas.openxmlformats.org/wordprocessingml/2006/main" xmlns:w14="http://schemas.microsoft.com/office/word/2010/wordml" xmlns:w15="http://schemas.microsoft.com/office/word/2012/wordml" xmlns:w16cex="http://schemas.microsoft.com/office/word/2018/wordml/cex" xmlns:w16cid="http://schemas.microsoft.com/office/word/2016/wordml/cid" xmlns:w16="http://schemas.microsoft.com/office/word/2018/wordml" xmlns:w16du="http://schemas.microsoft.com/office/word/2023/wordml/word16du" xmlns:w16sdtdh="http://schemas.microsoft.com/office/word/2020/wordml/sdtdatahash" xmlns:w16se="http://schemas.microsoft.com/office/word/2015/wordml/symex" mc:Ignorable="w14 w15 w16se w16cid w16 w16cex w16sdtdh w16du">
   <w:docDefaults>
     <w:rPrDefault>
       <w:rPr>
@@ -1462,6 +1459,7 @@
   <w:style w:type="character" w:default="1" w:styleId="DefaultParagraphFont">
     <w:name w:val="Default Paragraph Font"/>
     <w:uiPriority w:val="1"/>
+    <w:semiHidden/>
     <w:unhideWhenUsed/>
   </w:style>
   <w:style w:type="table" w:default="1" w:styleId="TableNormal">

</xml_diff>

<commit_message>
Updated Style Guide to include copyright details
</commit_message>
<xml_diff>
--- a/Documentation/SCO Project Style Guide.docx
+++ b/Documentation/SCO Project Style Guide.docx
@@ -61,12 +61,28 @@
     </w:p>
     <w:p>
       <w:r>
-        <w:t>Page Size: Typically A3</w:t>
-      </w:r>
-    </w:p>
-    <w:p>
-      <w:r>
-        <w:t>Staff Size: Typically 4.1mm. Ok to reduce on certain pages to allow more music to fit (nothing smaller than 3.7mm). Overall staff size can also be reduced to 4mm or increased to 4.4mm where applicable. Any other sizes, please check with me.</w:t>
+        <w:t xml:space="preserve">Page Size: </w:t>
+      </w:r>
+      <w:proofErr w:type="gramStart"/>
+      <w:r>
+        <w:t>Typically</w:t>
+      </w:r>
+      <w:proofErr w:type="gramEnd"/>
+      <w:r>
+        <w:t xml:space="preserve"> A3</w:t>
+      </w:r>
+    </w:p>
+    <w:p>
+      <w:r>
+        <w:t xml:space="preserve">Staff Size: </w:t>
+      </w:r>
+      <w:proofErr w:type="gramStart"/>
+      <w:r>
+        <w:t>Typically</w:t>
+      </w:r>
+      <w:proofErr w:type="gramEnd"/>
+      <w:r>
+        <w:t xml:space="preserve"> 4.1mm. Ok to reduce on certain pages to allow more music to fit (nothing smaller than 3.7mm). Overall staff size can also be reduced to 4mm or increased to 4.4mm where applicable. Any other sizes, please check with me.</w:t>
       </w:r>
     </w:p>
     <w:p/>
@@ -306,7 +322,15 @@
     <w:p/>
     <w:p>
       <w:r>
-        <w:t xml:space="preserve">Example setup below. Please add all of these details into the info and </w:t>
+        <w:t xml:space="preserve">Example setup below. Please add </w:t>
+      </w:r>
+      <w:proofErr w:type="gramStart"/>
+      <w:r>
+        <w:t>all of</w:t>
+      </w:r>
+      <w:proofErr w:type="gramEnd"/>
+      <w:r>
+        <w:t xml:space="preserve"> these details into the info and </w:t>
       </w:r>
       <w:r>
         <w:rPr>
@@ -622,7 +646,15 @@
     <w:p/>
     <w:p>
       <w:r>
-        <w:t xml:space="preserve">Additionally, if the composer didn’t use instruments changes in the first place, you will need to select the bars for which these particular instrument is being used, and just change it to percussion 5 lines (or whatever number of lines is being used). Then you can simply change the instrument name text/abbreviation accordingly. </w:t>
+        <w:t xml:space="preserve">Additionally, if the composer didn’t use instruments changes in the first place, you will need to select the bars for which </w:t>
+      </w:r>
+      <w:proofErr w:type="gramStart"/>
+      <w:r>
+        <w:t>these particular instrument</w:t>
+      </w:r>
+      <w:proofErr w:type="gramEnd"/>
+      <w:r>
+        <w:t xml:space="preserve"> is being used, and just change it to percussion 5 lines (or whatever number of lines is being used). Then you can simply change the instrument name text/abbreviation accordingly. </w:t>
       </w:r>
     </w:p>
     <w:p/>
@@ -748,7 +780,21 @@
         <w:rPr>
           <w:rFonts w:hint="cs"/>
         </w:rPr>
-        <w:t>roup all the winds by section i.e. [dizi][ sheng][</w:t>
+        <w:t>roup all the winds by section i.e. [dizi</w:t>
+      </w:r>
+      <w:proofErr w:type="gramStart"/>
+      <w:r>
+        <w:rPr>
+          <w:rFonts w:hint="cs"/>
+        </w:rPr>
+        <w:t>][</w:t>
+      </w:r>
+      <w:proofErr w:type="gramEnd"/>
+      <w:r>
+        <w:rPr>
+          <w:rFonts w:hint="cs"/>
+        </w:rPr>
+        <w:t xml:space="preserve"> sheng][</w:t>
       </w:r>
       <w:proofErr w:type="spellStart"/>
       <w:r>
@@ -812,9 +858,9 @@
           <w:color w:val="222222"/>
           <w:shd w:val="clear" w:color="auto" w:fill="FFFFFF"/>
         </w:rPr>
-        <w:t xml:space="preserve">, could we put the sanxian between zhongruan and daruan as well? Same reasoning, sort by instrument range rather than family. So by putting the </w:t>
-      </w:r>
-      <w:proofErr w:type="spellStart"/>
+        <w:t xml:space="preserve">, could we put the sanxian between zhongruan and daruan as well? Same reasoning, sort by instrument range rather than family. </w:t>
+      </w:r>
+      <w:proofErr w:type="gramStart"/>
       <w:r>
         <w:rPr>
           <w:rFonts w:ascii="Futura" w:hAnsi="Futura" w:cs="Futura" w:hint="cs"/>
@@ -823,9 +869,9 @@
           <w:color w:val="222222"/>
           <w:shd w:val="clear" w:color="auto" w:fill="FFFFFF"/>
         </w:rPr>
-        <w:t>guanzi</w:t>
-      </w:r>
-      <w:proofErr w:type="spellEnd"/>
+        <w:t>So</w:t>
+      </w:r>
+      <w:proofErr w:type="gramEnd"/>
       <w:r>
         <w:rPr>
           <w:rFonts w:ascii="Futura" w:hAnsi="Futura" w:cs="Futura" w:hint="cs"/>
@@ -834,6 +880,28 @@
           <w:color w:val="222222"/>
           <w:shd w:val="clear" w:color="auto" w:fill="FFFFFF"/>
         </w:rPr>
+        <w:t xml:space="preserve"> by putting the </w:t>
+      </w:r>
+      <w:proofErr w:type="spellStart"/>
+      <w:r>
+        <w:rPr>
+          <w:rFonts w:ascii="Futura" w:hAnsi="Futura" w:cs="Futura" w:hint="cs"/>
+          <w:i/>
+          <w:iCs/>
+          <w:color w:val="222222"/>
+          <w:shd w:val="clear" w:color="auto" w:fill="FFFFFF"/>
+        </w:rPr>
+        <w:t>guanzi</w:t>
+      </w:r>
+      <w:proofErr w:type="spellEnd"/>
+      <w:r>
+        <w:rPr>
+          <w:rFonts w:ascii="Futura" w:hAnsi="Futura" w:cs="Futura" w:hint="cs"/>
+          <w:i/>
+          <w:iCs/>
+          <w:color w:val="222222"/>
+          <w:shd w:val="clear" w:color="auto" w:fill="FFFFFF"/>
+        </w:rPr>
         <w:t xml:space="preserve"> in a different group this solves the “sort by range” issue.</w:t>
       </w:r>
     </w:p>
@@ -852,6 +920,317 @@
       </w:r>
     </w:p>
     <w:p/>
+    <w:p/>
+    <w:p/>
+    <w:p>
+      <w:pPr>
+        <w:rPr>
+          <w:b/>
+          <w:bCs/>
+        </w:rPr>
+      </w:pPr>
+      <w:r>
+        <w:rPr>
+          <w:b/>
+          <w:bCs/>
+        </w:rPr>
+        <w:t>Copyright Details</w:t>
+      </w:r>
+    </w:p>
+    <w:p>
+      <w:pPr>
+        <w:rPr>
+          <w:b/>
+          <w:bCs/>
+        </w:rPr>
+      </w:pPr>
+    </w:p>
+    <w:p>
+      <w:pPr>
+        <w:shd w:val="clear" w:color="auto" w:fill="FFFFFF"/>
+        <w:rPr>
+          <w:rFonts w:ascii="Times New Roman" w:eastAsia="Times New Roman" w:hAnsi="Times New Roman" w:cs="Times New Roman"/>
+          <w:color w:val="222222"/>
+          <w:kern w:val="0"/>
+          <w14:ligatures w14:val="none"/>
+        </w:rPr>
+      </w:pPr>
+      <w:r>
+        <w:rPr>
+          <w:rFonts w:ascii="Times New Roman" w:eastAsia="Times New Roman" w:hAnsi="Times New Roman" w:cs="Times New Roman"/>
+          <w:color w:val="222222"/>
+          <w:kern w:val="0"/>
+          <w14:ligatures w14:val="none"/>
+        </w:rPr>
+        <w:t>Copyright © Singapore Chinese Orchestra Ltd.</w:t>
+      </w:r>
+    </w:p>
+    <w:p>
+      <w:pPr>
+        <w:shd w:val="clear" w:color="auto" w:fill="FFFFFF"/>
+        <w:rPr>
+          <w:rFonts w:ascii="Times New Roman" w:eastAsia="Times New Roman" w:hAnsi="Times New Roman" w:cs="Times New Roman"/>
+          <w:color w:val="222222"/>
+          <w:kern w:val="0"/>
+          <w14:ligatures w14:val="none"/>
+        </w:rPr>
+      </w:pPr>
+      <w:r>
+        <w:rPr>
+          <w:rFonts w:ascii="Times New Roman" w:eastAsia="Times New Roman" w:hAnsi="Times New Roman" w:cs="Times New Roman"/>
+          <w:color w:val="222222"/>
+          <w:kern w:val="0"/>
+          <w14:ligatures w14:val="none"/>
+        </w:rPr>
+        <w:t xml:space="preserve">All Rights Reserved. </w:t>
+      </w:r>
+      <w:proofErr w:type="spellStart"/>
+      <w:r>
+        <w:rPr>
+          <w:rFonts w:ascii="Times New Roman" w:eastAsia="Times New Roman" w:hAnsi="Times New Roman" w:cs="Times New Roman"/>
+          <w:color w:val="222222"/>
+          <w:kern w:val="0"/>
+          <w14:ligatures w14:val="none"/>
+        </w:rPr>
+        <w:t>Unauthorised</w:t>
+      </w:r>
+      <w:proofErr w:type="spellEnd"/>
+      <w:r>
+        <w:rPr>
+          <w:rFonts w:ascii="Times New Roman" w:eastAsia="Times New Roman" w:hAnsi="Times New Roman" w:cs="Times New Roman"/>
+          <w:color w:val="222222"/>
+          <w:kern w:val="0"/>
+          <w14:ligatures w14:val="none"/>
+        </w:rPr>
+        <w:t xml:space="preserve"> printing, reproduction, scanning or distribution is strictly prohibited without the express permission of the copyright holder.</w:t>
+      </w:r>
+    </w:p>
+    <w:p>
+      <w:pPr>
+        <w:shd w:val="clear" w:color="auto" w:fill="FFFFFF"/>
+        <w:rPr>
+          <w:rFonts w:ascii="Times New Roman" w:eastAsia="Times New Roman" w:hAnsi="Times New Roman" w:cs="Times New Roman"/>
+          <w:color w:val="222222"/>
+          <w:kern w:val="0"/>
+          <w14:ligatures w14:val="none"/>
+        </w:rPr>
+      </w:pPr>
+      <w:r>
+        <w:rPr>
+          <w:rFonts w:ascii="DengXian" w:eastAsia="DengXian" w:hAnsi="DengXian" w:cs="Times New Roman" w:hint="eastAsia"/>
+          <w:color w:val="222222"/>
+          <w:kern w:val="0"/>
+          <w:lang w:eastAsia="zh-CN"/>
+          <w14:ligatures w14:val="none"/>
+        </w:rPr>
+        <w:t>版权所有</w:t>
+      </w:r>
+      <w:r>
+        <w:rPr>
+          <w:rFonts w:ascii="Times New Roman" w:eastAsia="Times New Roman" w:hAnsi="Times New Roman" w:cs="Times New Roman"/>
+          <w:color w:val="222222"/>
+          <w:kern w:val="0"/>
+          <w14:ligatures w14:val="none"/>
+        </w:rPr>
+        <w:t>,</w:t>
+      </w:r>
+      <w:r>
+        <w:rPr>
+          <w:rFonts w:ascii="DengXian" w:eastAsia="DengXian" w:hAnsi="DengXian" w:cs="Times New Roman" w:hint="eastAsia"/>
+          <w:color w:val="222222"/>
+          <w:kern w:val="0"/>
+          <w:lang w:eastAsia="zh-CN"/>
+          <w14:ligatures w14:val="none"/>
+        </w:rPr>
+        <w:t>未经许可</w:t>
+      </w:r>
+      <w:r>
+        <w:rPr>
+          <w:rFonts w:ascii="Times New Roman" w:eastAsia="Times New Roman" w:hAnsi="Times New Roman" w:cs="Times New Roman"/>
+          <w:color w:val="222222"/>
+          <w:kern w:val="0"/>
+          <w14:ligatures w14:val="none"/>
+        </w:rPr>
+        <w:t>,</w:t>
+      </w:r>
+      <w:r>
+        <w:rPr>
+          <w:rFonts w:ascii="DengXian" w:eastAsia="DengXian" w:hAnsi="DengXian" w:cs="Times New Roman" w:hint="eastAsia"/>
+          <w:color w:val="222222"/>
+          <w:kern w:val="0"/>
+          <w:lang w:eastAsia="zh-CN"/>
+          <w14:ligatures w14:val="none"/>
+        </w:rPr>
+        <w:t>不得以任何新式印刷、复制、扫描或发行。</w:t>
+      </w:r>
+    </w:p>
+    <w:p>
+      <w:pPr>
+        <w:shd w:val="clear" w:color="auto" w:fill="FFFFFF"/>
+        <w:rPr>
+          <w:rFonts w:ascii="Times New Roman" w:eastAsia="Times New Roman" w:hAnsi="Times New Roman" w:cs="Times New Roman"/>
+          <w:color w:val="222222"/>
+          <w:kern w:val="0"/>
+          <w14:ligatures w14:val="none"/>
+        </w:rPr>
+      </w:pPr>
+      <w:r>
+        <w:rPr>
+          <w:rFonts w:ascii="Times New Roman" w:eastAsia="Times New Roman" w:hAnsi="Times New Roman" w:cs="Times New Roman"/>
+          <w:color w:val="222222"/>
+          <w:kern w:val="0"/>
+          <w14:ligatures w14:val="none"/>
+        </w:rPr>
+        <w:t> </w:t>
+      </w:r>
+    </w:p>
+    <w:p>
+      <w:pPr>
+        <w:shd w:val="clear" w:color="auto" w:fill="FFFFFF"/>
+        <w:rPr>
+          <w:rFonts w:ascii="Times New Roman" w:eastAsia="Times New Roman" w:hAnsi="Times New Roman" w:cs="Times New Roman"/>
+          <w:b/>
+          <w:bCs/>
+          <w:color w:val="222222"/>
+          <w:kern w:val="0"/>
+          <w14:ligatures w14:val="none"/>
+        </w:rPr>
+      </w:pPr>
+      <w:r>
+        <w:rPr>
+          <w:rFonts w:ascii="Times New Roman" w:eastAsia="Times New Roman" w:hAnsi="Times New Roman" w:cs="Times New Roman"/>
+          <w:b/>
+          <w:bCs/>
+          <w:color w:val="222222"/>
+          <w:kern w:val="0"/>
+          <w14:ligatures w14:val="none"/>
+        </w:rPr>
+        <w:t>The first line has only English text, no Chinese.</w:t>
+      </w:r>
+    </w:p>
+    <w:p>
+      <w:pPr>
+        <w:shd w:val="clear" w:color="auto" w:fill="FFFFFF"/>
+        <w:rPr>
+          <w:rFonts w:ascii="Times New Roman" w:eastAsia="Times New Roman" w:hAnsi="Times New Roman" w:cs="Times New Roman"/>
+          <w:b/>
+          <w:bCs/>
+          <w:color w:val="222222"/>
+          <w:kern w:val="0"/>
+          <w14:ligatures w14:val="none"/>
+        </w:rPr>
+      </w:pPr>
+      <w:r>
+        <w:rPr>
+          <w:rFonts w:ascii="Times New Roman" w:eastAsia="Times New Roman" w:hAnsi="Times New Roman" w:cs="Times New Roman"/>
+          <w:b/>
+          <w:bCs/>
+          <w:color w:val="222222"/>
+          <w:kern w:val="0"/>
+          <w14:ligatures w14:val="none"/>
+        </w:rPr>
+        <w:t>For subsequent pages, use:</w:t>
+      </w:r>
+    </w:p>
+    <w:p>
+      <w:pPr>
+        <w:shd w:val="clear" w:color="auto" w:fill="FFFFFF"/>
+        <w:rPr>
+          <w:rFonts w:ascii="Times New Roman" w:eastAsia="Times New Roman" w:hAnsi="Times New Roman" w:cs="Times New Roman"/>
+          <w:color w:val="222222"/>
+          <w:kern w:val="0"/>
+          <w14:ligatures w14:val="none"/>
+        </w:rPr>
+      </w:pPr>
+      <w:r>
+        <w:rPr>
+          <w:rFonts w:ascii="Times New Roman" w:eastAsia="Times New Roman" w:hAnsi="Times New Roman" w:cs="Times New Roman"/>
+          <w:color w:val="222222"/>
+          <w:kern w:val="0"/>
+          <w14:ligatures w14:val="none"/>
+        </w:rPr>
+        <w:t> </w:t>
+      </w:r>
+    </w:p>
+    <w:p>
+      <w:pPr>
+        <w:shd w:val="clear" w:color="auto" w:fill="FFFFFF"/>
+        <w:rPr>
+          <w:rFonts w:ascii="Times New Roman" w:eastAsia="Times New Roman" w:hAnsi="Times New Roman" w:cs="Times New Roman"/>
+          <w:color w:val="222222"/>
+          <w:kern w:val="0"/>
+          <w14:ligatures w14:val="none"/>
+        </w:rPr>
+      </w:pPr>
+      <w:proofErr w:type="spellStart"/>
+      <w:r>
+        <w:rPr>
+          <w:rFonts w:ascii="Times New Roman" w:eastAsia="Times New Roman" w:hAnsi="Times New Roman" w:cs="Times New Roman"/>
+          <w:color w:val="222222"/>
+          <w:kern w:val="0"/>
+          <w14:ligatures w14:val="none"/>
+        </w:rPr>
+        <w:t>Unauthorised</w:t>
+      </w:r>
+      <w:proofErr w:type="spellEnd"/>
+      <w:r>
+        <w:rPr>
+          <w:rFonts w:ascii="Times New Roman" w:eastAsia="Times New Roman" w:hAnsi="Times New Roman" w:cs="Times New Roman"/>
+          <w:color w:val="222222"/>
+          <w:kern w:val="0"/>
+          <w14:ligatures w14:val="none"/>
+        </w:rPr>
+        <w:t xml:space="preserve"> printing, reproduction, scanning or distribution is strictly prohibited without the express permission of the copyright holder.</w:t>
+      </w:r>
+    </w:p>
+    <w:p>
+      <w:pPr>
+        <w:shd w:val="clear" w:color="auto" w:fill="FFFFFF"/>
+        <w:rPr>
+          <w:rFonts w:ascii="Times New Roman" w:eastAsia="Times New Roman" w:hAnsi="Times New Roman" w:cs="Times New Roman"/>
+          <w:color w:val="222222"/>
+          <w:kern w:val="0"/>
+          <w14:ligatures w14:val="none"/>
+        </w:rPr>
+      </w:pPr>
+      <w:r>
+        <w:rPr>
+          <w:rFonts w:ascii="DengXian" w:eastAsia="DengXian" w:hAnsi="DengXian" w:cs="Times New Roman" w:hint="eastAsia"/>
+          <w:color w:val="222222"/>
+          <w:kern w:val="0"/>
+          <w:lang w:eastAsia="zh-CN"/>
+          <w14:ligatures w14:val="none"/>
+        </w:rPr>
+        <w:t>未经许可</w:t>
+      </w:r>
+      <w:r>
+        <w:rPr>
+          <w:rFonts w:ascii="Times New Roman" w:eastAsia="Times New Roman" w:hAnsi="Times New Roman" w:cs="Times New Roman"/>
+          <w:color w:val="222222"/>
+          <w:kern w:val="0"/>
+          <w14:ligatures w14:val="none"/>
+        </w:rPr>
+        <w:t>,</w:t>
+      </w:r>
+      <w:r>
+        <w:rPr>
+          <w:rFonts w:ascii="DengXian" w:eastAsia="DengXian" w:hAnsi="DengXian" w:cs="Times New Roman" w:hint="eastAsia"/>
+          <w:color w:val="222222"/>
+          <w:kern w:val="0"/>
+          <w:lang w:eastAsia="zh-CN"/>
+          <w14:ligatures w14:val="none"/>
+        </w:rPr>
+        <w:t>不得以任何新式印刷、复制、扫描或发行。</w:t>
+      </w:r>
+    </w:p>
+    <w:p>
+      <w:pPr>
+        <w:rPr>
+          <w:b/>
+          <w:bCs/>
+        </w:rPr>
+      </w:pPr>
+    </w:p>
     <w:sectPr>
       <w:pgSz w:w="12240" w:h="15840"/>
       <w:pgMar w:top="1440" w:right="1440" w:bottom="1440" w:left="1440" w:header="720" w:footer="720" w:gutter="0"/>
@@ -1459,7 +1838,6 @@
   <w:style w:type="character" w:default="1" w:styleId="DefaultParagraphFont">
     <w:name w:val="Default Paragraph Font"/>
     <w:uiPriority w:val="1"/>
-    <w:semiHidden/>
     <w:unhideWhenUsed/>
   </w:style>
   <w:style w:type="table" w:default="1" w:styleId="TableNormal">

</xml_diff>

<commit_message>
Update SCO Project Style Guide.docx
</commit_message>
<xml_diff>
--- a/Documentation/SCO Project Style Guide.docx
+++ b/Documentation/SCO Project Style Guide.docx
@@ -1154,7 +1154,6 @@
     </w:p>
     <w:p>
       <w:pPr>
-        <w:shd w:val="clear" w:color="auto" w:fill="FFFFFF"/>
         <w:rPr>
           <w:rFonts w:ascii="Times New Roman" w:eastAsia="Times New Roman" w:hAnsi="Times New Roman" w:cs="Times New Roman"/>
           <w:color w:val="222222"/>
@@ -1162,7 +1161,6 @@
           <w14:ligatures w14:val="none"/>
         </w:rPr>
       </w:pPr>
-      <w:proofErr w:type="spellStart"/>
       <w:r>
         <w:rPr>
           <w:rFonts w:ascii="Times New Roman" w:eastAsia="Times New Roman" w:hAnsi="Times New Roman" w:cs="Times New Roman"/>
@@ -1170,66 +1168,8 @@
           <w:kern w:val="0"/>
           <w14:ligatures w14:val="none"/>
         </w:rPr>
-        <w:t>Unauthorised</w:t>
-      </w:r>
-      <w:proofErr w:type="spellEnd"/>
-      <w:r>
-        <w:rPr>
-          <w:rFonts w:ascii="Times New Roman" w:eastAsia="Times New Roman" w:hAnsi="Times New Roman" w:cs="Times New Roman"/>
-          <w:color w:val="222222"/>
-          <w:kern w:val="0"/>
-          <w14:ligatures w14:val="none"/>
-        </w:rPr>
-        <w:t xml:space="preserve"> printing, reproduction, scanning or distribution is strictly prohibited without the express permission of the copyright holder.</w:t>
-      </w:r>
-    </w:p>
-    <w:p>
-      <w:pPr>
-        <w:shd w:val="clear" w:color="auto" w:fill="FFFFFF"/>
-        <w:rPr>
-          <w:rFonts w:ascii="Times New Roman" w:eastAsia="Times New Roman" w:hAnsi="Times New Roman" w:cs="Times New Roman"/>
-          <w:color w:val="222222"/>
-          <w:kern w:val="0"/>
-          <w14:ligatures w14:val="none"/>
-        </w:rPr>
-      </w:pPr>
-      <w:r>
-        <w:rPr>
-          <w:rFonts w:ascii="DengXian" w:eastAsia="DengXian" w:hAnsi="DengXian" w:cs="Times New Roman" w:hint="eastAsia"/>
-          <w:color w:val="222222"/>
-          <w:kern w:val="0"/>
-          <w:lang w:eastAsia="zh-CN"/>
-          <w14:ligatures w14:val="none"/>
-        </w:rPr>
-        <w:t>未经许可</w:t>
-      </w:r>
-      <w:r>
-        <w:rPr>
-          <w:rFonts w:ascii="Times New Roman" w:eastAsia="Times New Roman" w:hAnsi="Times New Roman" w:cs="Times New Roman"/>
-          <w:color w:val="222222"/>
-          <w:kern w:val="0"/>
-          <w14:ligatures w14:val="none"/>
-        </w:rPr>
-        <w:t>,</w:t>
-      </w:r>
-      <w:r>
-        <w:rPr>
-          <w:rFonts w:ascii="DengXian" w:eastAsia="DengXian" w:hAnsi="DengXian" w:cs="Times New Roman" w:hint="eastAsia"/>
-          <w:color w:val="222222"/>
-          <w:kern w:val="0"/>
-          <w:lang w:eastAsia="zh-CN"/>
-          <w14:ligatures w14:val="none"/>
-        </w:rPr>
-        <w:t>不得以任何新式印刷、复制、扫描或发行。</w:t>
-      </w:r>
-    </w:p>
-    <w:p>
-      <w:pPr>
-        <w:rPr>
-          <w:b/>
-          <w:bCs/>
-        </w:rPr>
-      </w:pPr>
+        <w:t>Copyright © Singapore Chinese Orchestra Ltd.</w:t>
+      </w:r>
     </w:p>
     <w:sectPr>
       <w:pgSz w:w="12240" w:h="15840"/>

</xml_diff>

<commit_message>
Updated Doc with new copyright text
</commit_message>
<xml_diff>
--- a/Documentation/SCO Project Style Guide.docx
+++ b/Documentation/SCO Project Style Guide.docx
@@ -975,6 +975,35 @@
           <w14:ligatures w14:val="none"/>
         </w:rPr>
       </w:pPr>
+      <w:proofErr w:type="spellStart"/>
+      <w:proofErr w:type="gramStart"/>
+      <w:r>
+        <w:rPr>
+          <w:rFonts w:ascii="MS Mincho" w:eastAsia="MS Mincho" w:hAnsi="MS Mincho" w:cs="MS Mincho" w:hint="eastAsia"/>
+          <w:color w:val="222222"/>
+          <w:kern w:val="0"/>
+          <w14:ligatures w14:val="none"/>
+        </w:rPr>
+        <w:t>版</w:t>
+      </w:r>
+      <w:r>
+        <w:rPr>
+          <w:rFonts w:ascii="Yu Gothic" w:eastAsia="Yu Gothic" w:hAnsi="Yu Gothic" w:cs="Yu Gothic" w:hint="eastAsia"/>
+          <w:color w:val="222222"/>
+          <w:kern w:val="0"/>
+          <w14:ligatures w14:val="none"/>
+        </w:rPr>
+        <w:t>权</w:t>
+      </w:r>
+      <w:r>
+        <w:rPr>
+          <w:rFonts w:ascii="MS Mincho" w:eastAsia="MS Mincho" w:hAnsi="MS Mincho" w:cs="MS Mincho" w:hint="eastAsia"/>
+          <w:color w:val="222222"/>
+          <w:kern w:val="0"/>
+          <w14:ligatures w14:val="none"/>
+        </w:rPr>
+        <w:t>所有</w:t>
+      </w:r>
       <w:r>
         <w:rPr>
           <w:rFonts w:ascii="Times New Roman" w:eastAsia="Times New Roman" w:hAnsi="Times New Roman" w:cs="Times New Roman"/>
@@ -982,7 +1011,119 @@
           <w:kern w:val="0"/>
           <w14:ligatures w14:val="none"/>
         </w:rPr>
-        <w:t xml:space="preserve">All Rights Reserved. </w:t>
+        <w:t>,</w:t>
+      </w:r>
+      <w:r>
+        <w:rPr>
+          <w:rFonts w:ascii="MS Mincho" w:eastAsia="MS Mincho" w:hAnsi="MS Mincho" w:cs="MS Mincho" w:hint="eastAsia"/>
+          <w:color w:val="222222"/>
+          <w:kern w:val="0"/>
+          <w14:ligatures w14:val="none"/>
+        </w:rPr>
+        <w:t>未</w:t>
+      </w:r>
+      <w:r>
+        <w:rPr>
+          <w:rFonts w:ascii="Heiti TC" w:eastAsia="Heiti TC" w:hAnsi="Heiti TC" w:cs="Heiti TC" w:hint="eastAsia"/>
+          <w:color w:val="222222"/>
+          <w:kern w:val="0"/>
+          <w14:ligatures w14:val="none"/>
+        </w:rPr>
+        <w:t>经许</w:t>
+      </w:r>
+      <w:r>
+        <w:rPr>
+          <w:rFonts w:ascii="MS Mincho" w:eastAsia="MS Mincho" w:hAnsi="MS Mincho" w:cs="MS Mincho" w:hint="eastAsia"/>
+          <w:color w:val="222222"/>
+          <w:kern w:val="0"/>
+          <w14:ligatures w14:val="none"/>
+        </w:rPr>
+        <w:t>可</w:t>
+      </w:r>
+      <w:proofErr w:type="gramEnd"/>
+      <w:r>
+        <w:rPr>
+          <w:rFonts w:ascii="Times New Roman" w:eastAsia="Times New Roman" w:hAnsi="Times New Roman" w:cs="Times New Roman"/>
+          <w:color w:val="222222"/>
+          <w:kern w:val="0"/>
+          <w14:ligatures w14:val="none"/>
+        </w:rPr>
+        <w:t>,</w:t>
+      </w:r>
+      <w:r>
+        <w:rPr>
+          <w:rFonts w:ascii="MS Mincho" w:eastAsia="MS Mincho" w:hAnsi="MS Mincho" w:cs="MS Mincho" w:hint="eastAsia"/>
+          <w:color w:val="222222"/>
+          <w:kern w:val="0"/>
+          <w14:ligatures w14:val="none"/>
+        </w:rPr>
+        <w:t>不得以任何形式印刷、复制、</w:t>
+      </w:r>
+      <w:r>
+        <w:rPr>
+          <w:rFonts w:ascii="Heiti TC" w:eastAsia="Heiti TC" w:hAnsi="Heiti TC" w:cs="Heiti TC" w:hint="eastAsia"/>
+          <w:color w:val="222222"/>
+          <w:kern w:val="0"/>
+          <w14:ligatures w14:val="none"/>
+        </w:rPr>
+        <w:t>扫</w:t>
+      </w:r>
+      <w:r>
+        <w:rPr>
+          <w:rFonts w:ascii="MS Mincho" w:eastAsia="MS Mincho" w:hAnsi="MS Mincho" w:cs="MS Mincho" w:hint="eastAsia"/>
+          <w:color w:val="222222"/>
+          <w:kern w:val="0"/>
+          <w14:ligatures w14:val="none"/>
+        </w:rPr>
+        <w:t>描或</w:t>
+      </w:r>
+      <w:r>
+        <w:rPr>
+          <w:rFonts w:ascii="Heiti TC" w:eastAsia="Heiti TC" w:hAnsi="Heiti TC" w:cs="Heiti TC" w:hint="eastAsia"/>
+          <w:color w:val="222222"/>
+          <w:kern w:val="0"/>
+          <w14:ligatures w14:val="none"/>
+        </w:rPr>
+        <w:t>发</w:t>
+      </w:r>
+      <w:r>
+        <w:rPr>
+          <w:rFonts w:ascii="MS Mincho" w:eastAsia="MS Mincho" w:hAnsi="MS Mincho" w:cs="MS Mincho" w:hint="eastAsia"/>
+          <w:color w:val="222222"/>
+          <w:kern w:val="0"/>
+          <w14:ligatures w14:val="none"/>
+        </w:rPr>
+        <w:t>行</w:t>
+      </w:r>
+      <w:proofErr w:type="spellEnd"/>
+      <w:r>
+        <w:rPr>
+          <w:rFonts w:ascii="MS Mincho" w:eastAsia="MS Mincho" w:hAnsi="MS Mincho" w:cs="MS Mincho" w:hint="eastAsia"/>
+          <w:color w:val="222222"/>
+          <w:kern w:val="0"/>
+          <w14:ligatures w14:val="none"/>
+        </w:rPr>
+        <w:t>。</w:t>
+      </w:r>
+    </w:p>
+    <w:p>
+      <w:pPr>
+        <w:shd w:val="clear" w:color="auto" w:fill="FFFFFF"/>
+        <w:rPr>
+          <w:rFonts w:ascii="Times New Roman" w:eastAsia="Times New Roman" w:hAnsi="Times New Roman" w:cs="Times New Roman"/>
+          <w:color w:val="222222"/>
+          <w:kern w:val="0"/>
+          <w14:ligatures w14:val="none"/>
+        </w:rPr>
+      </w:pPr>
+      <w:r>
+        <w:rPr>
+          <w:rFonts w:ascii="Times New Roman" w:eastAsia="Times New Roman" w:hAnsi="Times New Roman" w:cs="Times New Roman"/>
+          <w:color w:val="222222"/>
+          <w:kern w:val="0"/>
+          <w14:ligatures w14:val="none"/>
+        </w:rPr>
+        <w:t xml:space="preserve">All rights reserved. </w:t>
       </w:r>
       <w:proofErr w:type="spellStart"/>
       <w:r>
@@ -1003,65 +1144,6 @@
           <w14:ligatures w14:val="none"/>
         </w:rPr>
         <w:t xml:space="preserve"> printing, reproduction, scanning or distribution is strictly prohibited without the express permission of the copyright holder.</w:t>
-      </w:r>
-    </w:p>
-    <w:p>
-      <w:pPr>
-        <w:shd w:val="clear" w:color="auto" w:fill="FFFFFF"/>
-        <w:rPr>
-          <w:rFonts w:ascii="Times New Roman" w:eastAsia="Times New Roman" w:hAnsi="Times New Roman" w:cs="Times New Roman"/>
-          <w:color w:val="222222"/>
-          <w:kern w:val="0"/>
-          <w14:ligatures w14:val="none"/>
-        </w:rPr>
-      </w:pPr>
-      <w:r>
-        <w:rPr>
-          <w:rFonts w:ascii="DengXian" w:eastAsia="DengXian" w:hAnsi="DengXian" w:cs="Times New Roman" w:hint="eastAsia"/>
-          <w:color w:val="222222"/>
-          <w:kern w:val="0"/>
-          <w:lang w:eastAsia="zh-CN"/>
-          <w14:ligatures w14:val="none"/>
-        </w:rPr>
-        <w:t>版权所有</w:t>
-      </w:r>
-      <w:r>
-        <w:rPr>
-          <w:rFonts w:ascii="Times New Roman" w:eastAsia="Times New Roman" w:hAnsi="Times New Roman" w:cs="Times New Roman"/>
-          <w:color w:val="222222"/>
-          <w:kern w:val="0"/>
-          <w14:ligatures w14:val="none"/>
-        </w:rPr>
-        <w:t>,</w:t>
-      </w:r>
-      <w:r>
-        <w:rPr>
-          <w:rFonts w:ascii="DengXian" w:eastAsia="DengXian" w:hAnsi="DengXian" w:cs="Times New Roman" w:hint="eastAsia"/>
-          <w:color w:val="222222"/>
-          <w:kern w:val="0"/>
-          <w:lang w:eastAsia="zh-CN"/>
-          <w14:ligatures w14:val="none"/>
-        </w:rPr>
-        <w:t>未经许可</w:t>
-      </w:r>
-      <w:r>
-        <w:rPr>
-          <w:rFonts w:ascii="Times New Roman" w:eastAsia="Times New Roman" w:hAnsi="Times New Roman" w:cs="Times New Roman"/>
-          <w:color w:val="222222"/>
-          <w:kern w:val="0"/>
-          <w14:ligatures w14:val="none"/>
-        </w:rPr>
-        <w:t>,</w:t>
-      </w:r>
-      <w:r>
-        <w:rPr>
-          <w:rFonts w:ascii="DengXian" w:eastAsia="DengXian" w:hAnsi="DengXian" w:cs="Times New Roman" w:hint="eastAsia"/>
-          <w:color w:val="222222"/>
-          <w:kern w:val="0"/>
-          <w:lang w:eastAsia="zh-CN"/>
-          <w14:ligatures w14:val="none"/>
-        </w:rPr>
-        <w:t>不得以任何新式印刷、复制、扫描或发行。</w:t>
       </w:r>
     </w:p>
     <w:p>

</xml_diff>

<commit_message>
Added Updated Text Style Document, Edited Piece 1, 2, 3 and 8
</commit_message>
<xml_diff>
--- a/Documentation/SCO Project Style Guide.docx
+++ b/Documentation/SCO Project Style Guide.docx
@@ -40,7 +40,21 @@
     </w:p>
     <w:p>
       <w:r>
-        <w:t>Text Font: Noto Serif</w:t>
+        <w:t xml:space="preserve">Text Font: </w:t>
+      </w:r>
+      <w:r>
+        <w:rPr>
+          <w:b/>
+          <w:bCs/>
+        </w:rPr>
+        <w:t>Noto Serif</w:t>
+      </w:r>
+      <w:r>
+        <w:rPr>
+          <w:b/>
+          <w:bCs/>
+        </w:rPr>
+        <w:t xml:space="preserve"> SC</w:t>
       </w:r>
     </w:p>
     <w:p/>
@@ -131,13 +145,12 @@
         <w:rPr>
           <w:b/>
           <w:bCs/>
-          <w:noProof/>
         </w:rPr>
         <w:drawing>
-          <wp:inline distT="0" distB="0" distL="0" distR="0" wp14:anchorId="7077A74F" wp14:editId="65EC0B80">
-            <wp:extent cx="5329989" cy="4891518"/>
-            <wp:effectExtent l="0" t="0" r="4445" b="0"/>
-            <wp:docPr id="845377508" name="Picture 1"/>
+          <wp:inline distT="0" distB="0" distL="0" distR="0" wp14:anchorId="7C7F631E" wp14:editId="7AE811DE">
+            <wp:extent cx="5943600" cy="5381625"/>
+            <wp:effectExtent l="0" t="0" r="0" b="3175"/>
+            <wp:docPr id="1487673610" name="Picture 1" descr="A screenshot of a computer&#10;&#10;Description automatically generated"/>
             <wp:cNvGraphicFramePr>
               <a:graphicFrameLocks xmlns:a="http://schemas.openxmlformats.org/drawingml/2006/main" noChangeAspect="1"/>
             </wp:cNvGraphicFramePr>
@@ -145,7 +158,7 @@
               <a:graphicData uri="http://schemas.openxmlformats.org/drawingml/2006/picture">
                 <pic:pic xmlns:pic="http://schemas.openxmlformats.org/drawingml/2006/picture">
                   <pic:nvPicPr>
-                    <pic:cNvPr id="845377508" name=""/>
+                    <pic:cNvPr id="1487673610" name="Picture 1" descr="A screenshot of a computer&#10;&#10;Description automatically generated"/>
                     <pic:cNvPicPr/>
                   </pic:nvPicPr>
                   <pic:blipFill>
@@ -157,7 +170,7 @@
                   <pic:spPr>
                     <a:xfrm>
                       <a:off x="0" y="0"/>
-                      <a:ext cx="5333455" cy="4894699"/>
+                      <a:ext cx="5943600" cy="5381625"/>
                     </a:xfrm>
                     <a:prstGeom prst="rect">
                       <a:avLst/>
@@ -184,7 +197,6 @@
           <w:b/>
           <w:bCs/>
         </w:rPr>
-        <w:lastRenderedPageBreak/>
         <w:t>Text Sizes</w:t>
       </w:r>
     </w:p>
@@ -276,48 +288,6 @@
           <w:bCs/>
         </w:rPr>
       </w:pPr>
-    </w:p>
-    <w:p>
-      <w:r>
-        <w:t>Title: 20 (Absolute)</w:t>
-      </w:r>
-    </w:p>
-    <w:p>
-      <w:r>
-        <w:t>Subtitle: 13.5</w:t>
-      </w:r>
-    </w:p>
-    <w:p>
-      <w:r>
-        <w:t>Composer: 11</w:t>
-      </w:r>
-    </w:p>
-    <w:p>
-      <w:r>
-        <w:t>Composition Year: 9</w:t>
-      </w:r>
-    </w:p>
-    <w:p>
-      <w:r>
-        <w:t xml:space="preserve">Instrument Name at Top Left (i.e. ‘Score’): 14.5 (May remove this in the </w:t>
-      </w:r>
-      <w:r>
-        <w:t>future but</w:t>
-      </w:r>
-      <w:r>
-        <w:t xml:space="preserve"> keep for now).</w:t>
-      </w:r>
-    </w:p>
-    <w:p>
-      <w:r>
-        <w:t>Tempo: 12.5. However</w:t>
-      </w:r>
-      <w:r>
-        <w:t>,</w:t>
-      </w:r>
-      <w:r>
-        <w:t xml:space="preserve"> note that it uses a blend of fonts – Noto Serif for the text, but Norfolk for the brackets.</w:t>
-      </w:r>
     </w:p>
     <w:p/>
     <w:p>
@@ -456,42 +426,48 @@
     </w:p>
     <w:p>
       <w:r>
-        <w:t>Main Instrument/Player Name: 7</w:t>
-      </w:r>
-    </w:p>
-    <w:p>
-      <w:r>
-        <w:t>Percussion Name: 6</w:t>
-      </w:r>
-    </w:p>
-    <w:p/>
-    <w:p>
-      <w:r>
+        <w:t xml:space="preserve">Main Instrument/Player Name: </w:t>
+      </w:r>
+      <w:r>
+        <w:t>8</w:t>
+      </w:r>
+    </w:p>
+    <w:p>
+      <w:r>
+        <w:t xml:space="preserve">Percussion Name: </w:t>
+      </w:r>
+      <w:r>
+        <w:t>7</w:t>
+      </w:r>
+    </w:p>
+    <w:p/>
+    <w:p>
+      <w:r>
+        <w:t>For percussion instruments</w:t>
+      </w:r>
+      <w:r>
+        <w:t xml:space="preserve"> </w:t>
+      </w:r>
+      <w:r>
+        <w:rPr>
+          <w:b/>
+          <w:bCs/>
+        </w:rPr>
+        <w:t>excluding Timpani</w:t>
+      </w:r>
+      <w:r>
+        <w:t xml:space="preserve">, keep the percussion player at size 7, while the actual current percussion name should be at size 6. (See example below). For percussion, we will skip out on the English name given the limited space. </w:t>
+      </w:r>
+    </w:p>
+    <w:p/>
+    <w:p/>
+    <w:p/>
+    <w:p>
+      <w:r>
+        <w:rPr>
+          <w:noProof/>
+        </w:rPr>
         <w:lastRenderedPageBreak/>
-        <w:t>For percussion instruments</w:t>
-      </w:r>
-      <w:r>
-        <w:t xml:space="preserve"> </w:t>
-      </w:r>
-      <w:r>
-        <w:rPr>
-          <w:b/>
-          <w:bCs/>
-        </w:rPr>
-        <w:t>excluding Timpani</w:t>
-      </w:r>
-      <w:r>
-        <w:t xml:space="preserve">, keep the percussion player at size 7, while the actual current percussion name should be at size 6. (See example below). For percussion, we will skip out on the English name given the limited space. </w:t>
-      </w:r>
-    </w:p>
-    <w:p/>
-    <w:p/>
-    <w:p/>
-    <w:p>
-      <w:r>
-        <w:rPr>
-          <w:noProof/>
-        </w:rPr>
         <w:drawing>
           <wp:inline distT="0" distB="0" distL="0" distR="0" wp14:anchorId="0EA24422" wp14:editId="43A3E26E">
             <wp:extent cx="5289304" cy="2648607"/>
@@ -962,7 +938,25 @@
           <w:kern w:val="0"/>
           <w14:ligatures w14:val="none"/>
         </w:rPr>
-        <w:t>Copyright © Singapore Chinese Orchestra Ltd.</w:t>
+        <w:t>Copyright © Singapore Chinese Orchestra</w:t>
+      </w:r>
+      <w:r>
+        <w:rPr>
+          <w:rFonts w:ascii="Times New Roman" w:eastAsia="Times New Roman" w:hAnsi="Times New Roman" w:cs="Times New Roman"/>
+          <w:color w:val="222222"/>
+          <w:kern w:val="0"/>
+          <w14:ligatures w14:val="none"/>
+        </w:rPr>
+        <w:t xml:space="preserve"> Co.</w:t>
+      </w:r>
+      <w:r>
+        <w:rPr>
+          <w:rFonts w:ascii="Times New Roman" w:eastAsia="Times New Roman" w:hAnsi="Times New Roman" w:cs="Times New Roman"/>
+          <w:color w:val="222222"/>
+          <w:kern w:val="0"/>
+          <w14:ligatures w14:val="none"/>
+        </w:rPr>
+        <w:t xml:space="preserve"> Ltd.</w:t>
       </w:r>
     </w:p>
     <w:p>
@@ -1250,7 +1244,25 @@
           <w:kern w:val="0"/>
           <w14:ligatures w14:val="none"/>
         </w:rPr>
-        <w:t>Copyright © Singapore Chinese Orchestra Ltd.</w:t>
+        <w:t>Copyright © Singapore Chinese Orchestra</w:t>
+      </w:r>
+      <w:r>
+        <w:rPr>
+          <w:rFonts w:ascii="Times New Roman" w:eastAsia="Times New Roman" w:hAnsi="Times New Roman" w:cs="Times New Roman"/>
+          <w:color w:val="222222"/>
+          <w:kern w:val="0"/>
+          <w14:ligatures w14:val="none"/>
+        </w:rPr>
+        <w:t xml:space="preserve"> Co.</w:t>
+      </w:r>
+      <w:r>
+        <w:rPr>
+          <w:rFonts w:ascii="Times New Roman" w:eastAsia="Times New Roman" w:hAnsi="Times New Roman" w:cs="Times New Roman"/>
+          <w:color w:val="222222"/>
+          <w:kern w:val="0"/>
+          <w14:ligatures w14:val="none"/>
+        </w:rPr>
+        <w:t xml:space="preserve"> Ltd.</w:t>
       </w:r>
     </w:p>
     <w:sectPr>

</xml_diff>